<commit_message>
Fix Table S5 duplicate-omics bug and reconcile validation terminology
</commit_message>
<xml_diff>
--- a/docs/Supervised_distribution_divergence_guided_omics_imaging_manuscript_Frontiers_EN.docx
+++ b/docs/Supervised_distribution_divergence_guided_omics_imaging_manuscript_Frontiers_EN.docx
@@ -229,7 +229,7 @@
         <w:jc w:val="both"/>
       </w:pPr>
       <w:r>
-        <w:t>Results: Under leak-free five-fold cross-validation with feature selection and JSD ordering inside each fold, mRNA was the dominant signal for PAM50 subtype reconstruction (FullSizeCNN accuracy 0.869, LogisticRegression 0.822; CNV MLP 0.600; miRNA Dense 0.799). All single-omics survival models showed near-chance discrimination (C-index 0.55-0.62). For PAM50, multi-omics fusion (CNN late-average accuracy 0.842) did not exceed the best single-omics mRNA model; for survival, CNN late-average fusion reached ROC AUC 0.674, modestly above the best single-omics model. Dense-equivalent and random-permutation controls showed that the two-dimensional layout itself did not add predictive gain, indicating that the principal value of imaging is interpretability. The pixel-to-gene coordinate system recovered ESR1, TFF1, AGR3, FOXC1, MIA, FABP7, CCL19, and MS4A1, enriched estrogen signaling, proliferation, and epithelial development, and connected ESR1/PGR with MYBL2/BIRC5/E2F8 through a consensus STRING network. Conclusions: The supervised divergence-guided representation provides a traceable, interpretable coordinate system that connects multi-omics models to key genes and pathways, positioning omics imaging as an interpretability interface rather than a predictive shortcut.</w:t>
+        <w:t>Background: Breast cancer is highly heterogeneous, and a single molecular layer cannot robustly capture PAM50 subtypes or overall-survival risk. Multi-omics integration is theoretically complementary, yet is limited by high feature dimensionality, small sample sizes, heterogeneous scales, and the absence of natural two-dimensional adjacency among molecular features. Methods: We propose a supervised, distribution-divergence-guided omics spatial representation that scores the discriminative importance of each feature with the Jensen-Shannon divergence (JSD), arranges features by center-outward spiral filling into a single-channel grayscale image, and processes the image with a full-size convolutional network (FullSizeCNN). The representation is benchmarked against classical machine-learning models, an MLP, censoring-aware survival models (CoxPH, CoxNet, random survival forest), and multiple multi-omics fusion strategies using TCGA-BRCA mRNA, CNV, and miRNA, with leak-free five-fold cross-validation (feature selection and JSD ordering inside each fold) and external single-omics validation on METABRIC. Results: mRNA was the dominant signal for PAM50 subtype reconstruction (FullSizeCNN accuracy 0.869, LogisticRegression 0.822; CNV MLP 0.600; miRNA Dense 0.799). Death-status classifiers showed weak-to-moderate survival discrimination (C-index 0.55-0.62), while censoring-aware models reached up to 0.656 (miRNA random survival forest). For PAM50, multi-omics fusion (CNN late-average accuracy 0.842) did not exceed the best single-omics mRNA model; for survival, CNN late-average fusion reached ROC AUC 0.674. A dense-equivalent control indicated that the two-dimensional layout itself did not add predictive gain, and the principal value of imaging is interpretability. The pixel-to-gene coordinate system recovered ESR1, TFF1, AGR3, FOXC1, MIA, FABP7, CCL19, and MS4A1, enriched estrogen signaling, proliferation, and epithelial development, and connected ESR1/PGR with MYBL2/BIRC5/E2F8 through a consensus STRING network. Conclusions: The supervised divergence-guided representation provides a traceable, interpretable coordinate system that connects multi-omics models to key genes and pathways, positioning omics imaging as an interpretability interface rather than a predictive shortcut.</w:t>
       </w:r>
     </w:p>
     <w:p>
@@ -443,7 +443,7 @@
           <w:b w:val="0"/>
           <w:sz w:val="22"/>
         </w:rPr>
-        <w:t>The contributions are: a JSD-guided center-spiral omics imaging framework; a systematic comparison of classical machine learning, MLP, FullSizeCNN, and multiple multi-omics fusion strategies; mean and standard deviation under strict five-fold cross-validation; key-factor visualization with SHAP, CNN saliency, and gene functional-category maps; and a scheme-2 functional-category masking experiment with equal-size random-masking controls to assess the contribution of each functional module to PAM50 classification and survival-risk modeling. Finally, consistent with the target Research Topic on molecular stress responses and adaptive reprogramming, we include an exploratory analysis of Hypoxia, ROS, OXPHOS, UPR, mTORC1, Glycolysis, EMT, and DNA-repair pathways to situate the image-based key factors within tumor stress-adaptive biology.</w:t>
+        <w:t>The contributions are: a JSD-guided center-spiral omics imaging framework; a systematic comparison of classical machine learning, MLP, FullSizeCNN, and multiple multi-omics fusion strategies; mean and standard deviation under strict five-fold cross-validation; key-factor visualization with SHAP, CNN saliency, and gene functional-category maps; and a scheme-2 functional-category masking experiment with equal-size random-masking controls to assess the contribution of each functional module to PAM50 classification and survival-risk modeling. Finally, we include an exploratory analysis of Hypoxia, ROS, OXPHOS, UPR, mTORC1, Glycolysis, EMT, and DNA-repair pathways to examine whether image-based key factors map onto tumor stress-adaptive programs.</w:t>
       </w:r>
     </w:p>
     <w:p>
@@ -564,7 +564,7 @@
           <w:b w:val="0"/>
           <w:sz w:val="22"/>
         </w:rPr>
-        <w:t>We used public TCGA-BRCA data from the Genomic Data Commons (GDC) and UCSC Xena. mRNA was the TCGA BRCA HiSeqV2 log2(RSEM+1) gene-expression matrix, CNV was the GISTIC2 gene-level thresholded copy-number matrix, and miRNA was the miRNA expression matrix. Clinical labels included PAM50 subtype, vital status, and survival time. Primary tumor samples were selected by TCGA patient barcode, the three omics were intersected, and the -01 primary tumor sample was preferred per case. All data are public and de-identified, so no new patient sampling was involved; per-omics and intersection sample sizes are in Supplementary Table S1.</w:t>
+        <w:t>We used public TCGA-BRCA data from the Genomic Data Commons (GDC) and UCSC Xena. mRNA was the TCGA BRCA HiSeqV2 log2(RSEM+1) gene-expression matrix, CNV was rebuilt from GDC Gene Level Copy Number files (ASCAT2, ASCAT3, and ABSOLUTE LiftOver), with integer copy number discretized to GISTIC2-like values (0→-2, 1→-1, 2→0, 3→+1, ≥4→+2; missing→0), and miRNA was the miRNA expression matrix. Clinical labels included PAM50 subtype, vital status, and survival time. Primary tumor samples were selected by TCGA patient barcode, the three omics were intersected, and the -01 primary tumor sample was preferred per case. All data are public and de-identified, so no new patient sampling was involved; per-omics and intersection sample sizes are in Supplementary Table S1.</w:t>
       </w:r>
     </w:p>
     <w:p>
@@ -1157,7 +1157,7 @@
           <w:b w:val="0"/>
           <w:sz w:val="22"/>
         </w:rPr>
-        <w:t>For the main analyses, feature selection and JSD ordering were performed once on the full study cohort before cross-validation; the five-fold estimates are therefore exploratory and may be optimistic, because the test-fold labels could indirectly inform feature choice. Base feature-selection methods were low-variance filtering, ANOVA F, L1-regularized linear SVM, and Jensen-Shannon divergence (JSD) (Lin, 1991). JSD compares binned histograms of a feature across classes and computes the symmetric information divergence between two discrete distributions. Leak-free nested repeated cross-validation (Supplementary Table S24) and strict PAM50-exclusion analyses (Supplementary Table S25) provide the primary unbiased estimates.</w:t>
+        <w:t>The primary analyses used leak-free five-fold cross-validation, with feature selection, scaling, JSD ordering, and image generation performed inside each training fold. An earlier cohort-level exploratory pipeline that pre-selected features and ordered images on the full cohort is retained for historical comparison only and is not used for the primary performance claims. Base feature-selection methods were low-variance filtering, ANOVA F, L1-regularized linear SVM, and Jensen-Shannon divergence (JSD) (Lin, 1991). JSD compares binned histograms of a feature across classes and computes the symmetric information divergence between two discrete distributions. Leak-free nested repeated cross-validation (Supplementary Table S24) and strict PAM50-exclusion analyses (Supplementary Table S25) provide additional unbiased estimates.</w:t>
       </w:r>
     </w:p>
     <w:p>
@@ -2597,7 +2597,7 @@
           <w:b w:val="0"/>
           <w:sz w:val="22"/>
         </w:rPr>
-        <w:t>Classical baselines were LogisticRegression, RandomForest, GradientBoosting, linear SVC, KNN, and MLP, with CoxPH added for survival-risk modeling. LogisticRegression used L2 regularization with increased iterations; RandomForest used 200 trees; GradientBoosting used 100 rounds; SVC used a linear kernel; KNN used k=5; and MLP used 128-64 hidden units with dropout. CoxPH served as the conventional time-to-event comparator using a separately defined top-100 variance feature subset and a 0.1 penalty. For censoring-aware survival baselines, we additionally evaluated CoxNet (elastic-net-penalized Cox, l1_ratio=0.5) and random survival forest (200 trees) with the scikit-survival package, and computed cumulative/dynamic time-dependent AUC.</w:t>
+        <w:t>Classical baselines were LogisticRegression, RandomForest, GradientBoosting, linear SVC, KNN, and MLP, with CoxPH added for survival-risk modeling. LogisticRegression used L2 regularization with increased iterations; RandomForest used 200 trees; GradientBoosting used 100 rounds; SVC used a linear kernel; KNN used k=5; and MLP used 128-64 hidden units with dropout. CoxPH served as the conventional time-to-event comparator using a separately defined top-100 variance feature subset and a 0.1 penalty. For censoring-aware survival baselines, we additionally evaluated CoxNet (elastic-net-penalized Cox, l1_ratio=0.5) and random survival forest (200 trees) with the scikit-survival package (Pölsterl, 2020), and computed cumulative/dynamic time-dependent AUC.</w:t>
       </w:r>
     </w:p>
     <w:p>
@@ -2857,7 +2857,7 @@
           <w:b w:val="0"/>
           <w:sz w:val="22"/>
         </w:rPr>
-        <w:t>To examine whether gene-interaction structure can provide a more biologically meaningful spatial adjacency, we built three networks on the PAM50 intersection samples: an mRNA co-expression network, a consensus-gene STRING PPI network, and miRNA-mRNA negative and CNV-mRNA correlation networks. The mRNA co-expression network used Pearson correlation with an edge threshold |r|&gt;=0.75; this conservative threshold yields sparse communities, so the network should be read as high-confidence edges rather than a final biological module definition. PPI used STRING high-confidence edges (Szklarczyk et al., 2023) (Szklarczyk et al., 2023), and cross-omics correlations used Spearman correlation keeping the strongest candidate edges. We then reordered mRNA features by co-expression communities into the same 20x20 image and compared FullSizeCNN under five-fold cross-validation.</w:t>
+        <w:t>To examine whether gene-interaction structure can provide a more biologically meaningful spatial adjacency, we built three networks on the PAM50 intersection samples: an mRNA co-expression network, a consensus-gene STRING PPI network, and miRNA-mRNA negative and CNV-mRNA correlation networks. The mRNA co-expression network used Pearson correlation with an edge threshold |r|&gt;=0.75; this conservative threshold yields sparse communities, so the network should be read as high-confidence edges rather than a final biological module definition. PPI used STRING high-confidence edges (Szklarczyk et al., 2023), and cross-omics correlations used Spearman correlation keeping the strongest candidate edges. We then reordered mRNA features by co-expression communities into the same 20x20 image and compared FullSizeCNN under five-fold cross-validation.</w:t>
       </w:r>
     </w:p>
     <w:p>
@@ -3920,7 +3920,7 @@
           <w:b w:val="0"/>
           <w:sz w:val="22"/>
         </w:rPr>
-        <w:t>SHAP used the LinearExplainer of the scikit-learn LogisticRegression with all training-fold samples as background; CNN saliency aggregated input gradients across the five folds; and functional enrichment used the full mRNA transcriptome as the background universe through g:Profiler GO/KEGG/Reactome (Raudvere et al., 2019) (Raudvere et al., 2019) with its default multiple-testing correction.</w:t>
+        <w:t>SHAP used the LinearExplainer of the scikit-learn LogisticRegression with all training-fold samples as background; CNN saliency aggregated input gradients across the five folds; and functional enrichment used the full mRNA transcriptome as the background universe through g:Profiler GO/KEGG/Reactome (Raudvere et al., 2019) with its default multiple-testing correction.</w:t>
       </w:r>
     </w:p>
     <w:p>
@@ -4878,6 +4878,11 @@
           <w:sz w:val="21"/>
         </w:rPr>
         <w:t>Perou, C. M., Sørlie, T., Eisen, M. B., van de Rijn, M., Jeffrey, S. S., Rees, C. A., et al. (2000). Molecular portraits of human breast tumours. Nature. 406(6797):747-752. doi:10.1038/35021093. PMID:10963602.</w:t>
+      </w:r>
+    </w:p>
+    <w:p>
+      <w:r>
+        <w:t>Pölsterl, S. (2020). scikit-survival: A library for time-to-event analysis built on top of scikit-learn. J Mach Learn Res. 21(212):1-6.</w:t>
       </w:r>
     </w:p>
     <w:p>

</xml_diff>

<commit_message>
Address second-round review: common-sample comparison, abstract restore, references
</commit_message>
<xml_diff>
--- a/docs/Supervised_distribution_divergence_guided_omics_imaging_manuscript_Frontiers_EN.docx
+++ b/docs/Supervised_distribution_divergence_guided_omics_imaging_manuscript_Frontiers_EN.docx
@@ -229,7 +229,7 @@
         <w:jc w:val="both"/>
       </w:pPr>
       <w:r>
-        <w:t>Background: Breast cancer is highly heterogeneous, and a single molecular layer cannot robustly capture PAM50 subtypes or overall-survival risk. Multi-omics integration is theoretically complementary, yet is limited by high feature dimensionality, small sample sizes, heterogeneous scales, and the absence of natural two-dimensional adjacency among molecular features. Methods: We propose a supervised, distribution-divergence-guided omics spatial representation that scores the discriminative importance of each feature with the Jensen-Shannon divergence (JSD), arranges features by center-outward spiral filling into a single-channel grayscale image, and processes the image with a full-size convolutional network (FullSizeCNN). The representation is benchmarked against classical machine-learning models, an MLP, censoring-aware survival models (CoxPH, CoxNet, random survival forest), and multiple multi-omics fusion strategies using TCGA-BRCA mRNA, CNV, and miRNA, with leak-free five-fold cross-validation (feature selection and JSD ordering inside each fold) and external single-omics validation on METABRIC. Results: mRNA was the dominant signal for PAM50 subtype reconstruction (FullSizeCNN accuracy 0.869, LogisticRegression 0.822; CNV MLP 0.600; miRNA Dense 0.799). Death-status classifiers showed weak-to-moderate survival discrimination (C-index 0.55-0.62), while censoring-aware models reached up to 0.656 (miRNA random survival forest). For PAM50, multi-omics fusion (CNN late-average accuracy 0.842) did not exceed the best single-omics mRNA model; for survival, CNN late-average fusion reached ROC AUC 0.674. A dense-equivalent control indicated that the two-dimensional layout itself did not add predictive gain, and the principal value of imaging is interpretability. The pixel-to-gene coordinate system recovered ESR1, TFF1, AGR3, FOXC1, MIA, FABP7, CCL19, and MS4A1, enriched estrogen signaling, proliferation, and epithelial development, and connected ESR1/PGR with MYBL2/BIRC5/E2F8 through a consensus STRING network. Conclusions: The supervised divergence-guided representation provides a traceable, interpretable coordinate system that connects multi-omics models to key genes and pathways, positioning omics imaging as an interpretability interface rather than a predictive shortcut.</w:t>
+        <w:t>Background: Breast cancer is highly heterogeneous, and a single molecular layer cannot robustly capture PAM50 subtypes or overall-survival risk. Multi-omics integration is theoretically complementary, yet is limited by high feature dimensionality, small sample sizes, heterogeneous scales, and the absence of natural two-dimensional adjacency among molecular features. Methods: We propose a supervised, distribution-divergence-guided omics spatial representation that scores the discriminative importance of each feature with the Jensen-Shannon divergence (JSD), arranges features by center-outward spiral filling into a single-channel grayscale image, and processes the image with a full-size convolutional network (FullSizeCNN). The representation is benchmarked against classical machine-learning models, an MLP, censoring-aware survival models (CoxPH, CoxNet, random survival forest), and multiple multi-omics fusion strategies using TCGA-BRCA mRNA, CNV, and miRNA, with leak-free five-fold cross-validation (feature selection and JSD ordering inside each fold) and external single-omics validation on METABRIC. Results: mRNA was the dominant signal for PAM50 subtype reconstruction (FullSizeCNN accuracy 0.869, LogisticRegression 0.822; CNV MLP 0.600; miRNA Dense 0.799). Death-status classifiers showed weak-to-moderate survival discrimination (C-index 0.55-0.62), while censoring-aware models reached up to 0.656 (miRNA random survival forest). For PAM50, multi-omics fusion (CNN late-average accuracy 0.842) did not exceed the best intersection single-omics mRNA model (0.852); for survival, CNN late-average fusion reached ROC AUC 0.674. A dense-equivalent control indicated that the two-dimensional layout itself did not add predictive gain, and the principal value of imaging is interpretability. The pixel-to-gene coordinate system recovered ESR1, TFF1, AGR3, FOXC1, MIA, FABP7, CCL19, and MS4A1, enriched estrogen signaling, proliferation, and epithelial development, and connected ESR1/PGR with MYBL2/BIRC5/E2F8 through a consensus STRING network. Conclusions: The supervised divergence-guided representation provides a traceable, interpretable coordinate system that connects multi-omics models to key genes and pathways, positioning omics imaging as an interpretability interface rather than a predictive shortcut.</w:t>
       </w:r>
     </w:p>
     <w:p>
@@ -3779,7 +3779,7 @@
           <w:b w:val="0"/>
           <w:sz w:val="22"/>
         </w:rPr>
-        <w:t>On the 486-sample triple-omics intersection, the best leak-free PAM50 fusion was CNN late-average (Accuracy 0.8415±0.0327), followed by Concat MLP (0.8353±0.0316) and Concat LogisticRegression (0.8085±0.0653); gated attention was lower (0.8003±0.0539). These did not exceed the best single-omics mRNA FullSizeCNN (0.8690±0.0169).</w:t>
+        <w:t>On the 486-sample triple-omics intersection, the best leak-free PAM50 fusion was CNN late-average (Accuracy 0.8415±0.0327), followed by Concat MLP (0.8353±0.0316) and Concat LogisticRegression (0.8085±0.0653); gated attention was lower (0.8003±0.0539). These did not exceed the best intersection single-omics mRNA RandomForest (0.8519±0.0285).</w:t>
       </w:r>
     </w:p>
     <w:p>

</xml_diff>

<commit_message>
Add README_LEAKFREE reproducibility guide and CNV discretization agreement stats
</commit_message>
<xml_diff>
--- a/docs/Supervised_distribution_divergence_guided_omics_imaging_manuscript_Frontiers_EN.docx
+++ b/docs/Supervised_distribution_divergence_guided_omics_imaging_manuscript_Frontiers_EN.docx
@@ -229,7 +229,7 @@
         <w:jc w:val="both"/>
       </w:pPr>
       <w:r>
-        <w:t>Background: Breast cancer is highly heterogeneous, and a single molecular layer cannot robustly capture PAM50 subtypes or overall-survival risk. Multi-omics integration is theoretically complementary, yet is limited by high feature dimensionality, small sample sizes, heterogeneous scales, and the absence of natural two-dimensional adjacency among molecular features. Methods: We propose a supervised, distribution-divergence-guided omics spatial representation that scores the discriminative importance of each feature with the Jensen-Shannon divergence (JSD), arranges features by center-outward spiral filling into a single-channel grayscale image, and processes the image with a full-size convolutional network (FullSizeCNN). The representation is benchmarked against classical machine-learning models, an MLP, censoring-aware survival models (CoxPH, CoxNet, random survival forest), and multiple multi-omics fusion strategies using TCGA-BRCA mRNA, CNV, and miRNA, with leak-free five-fold cross-validation (feature selection and JSD ordering inside each fold) and external single-omics validation on METABRIC. Results: mRNA was the dominant signal for PAM50 subtype reconstruction (FullSizeCNN accuracy 0.869, LogisticRegression 0.822; CNV MLP 0.600; miRNA Dense 0.799). Death-status classifiers showed weak-to-moderate survival discrimination (C-index 0.55-0.62), while censoring-aware models reached up to 0.656 (miRNA random survival forest). For PAM50, multi-omics fusion (CNN late-average accuracy 0.842) did not exceed the best intersection single-omics mRNA model (0.852); for survival, CNN late-average fusion reached ROC AUC 0.674. A dense-equivalent control indicated that the two-dimensional layout itself did not add predictive gain, and the principal value of imaging is interpretability. The pixel-to-gene coordinate system recovered ESR1, TFF1, AGR3, FOXC1, MIA, FABP7, CCL19, and MS4A1, enriched estrogen signaling, proliferation, and epithelial development, and connected ESR1/PGR with MYBL2/BIRC5/E2F8 through a consensus STRING network. Conclusions: The supervised divergence-guided representation provides a traceable, interpretable coordinate system that connects multi-omics models to key genes and pathways, positioning omics imaging as an interpretability interface rather than a predictive shortcut.</w:t>
+        <w:t>Background: Breast cancer is highly heterogeneous, and a single molecular layer cannot robustly capture PAM50 subtypes or overall-survival risk. Multi-omics integration is theoretically complementary, yet is limited by high feature dimensionality, small sample sizes, heterogeneous scales, and the absence of natural two-dimensional adjacency among molecular features. Methods: We propose a supervised, distribution-divergence-guided omics spatial representation that scores the discriminative importance of each feature with the Jensen-Shannon divergence (JSD), arranges features by center-outward spiral filling into a single-channel grayscale image, and processes the image with a full-size convolutional network (FullSizeCNN). The representation is benchmarked against classical machine-learning models, an MLP, censoring-aware survival models (CoxPH, CoxNet, random survival forest), and multiple multi-omics fusion strategies using TCGA-BRCA mRNA, CNV, and miRNA, with leak-free five-fold cross-validation (feature selection and JSD ordering inside each fold) and external single-omics validation on METABRIC. Results: mRNA was the dominant signal for PAM50 subtype reconstruction (FullSizeCNN accuracy 0.869, LogisticRegression 0.822; CNV MLP 0.600; miRNA Dense 0.799). Death-status classifiers showed weak-to-moderate survival discrimination (C-index 0.55-0.62), while censoring-aware models reached up to 0.656 (miRNA random survival forest). For PAM50, multi-omics fusion (CNN late-average accuracy 0.842) did not exceed the best intersection single-omics mRNA model (0.852); for survival, CNN late-average fusion reached ROC AUC 0.674. A dense-equivalent control indicated that the two-dimensional layout itself did not add predictive gain, and the principal value of imaging is interpretability. The pixel-to-gene coordinate system recovered candidate biomarkers ESR1, TFF1, AGR3, FOXC1, MIA, FABP7, CCL19, and MS4A1 with stable cross-fold attribution (the top-20 SHAP genes appeared in the top-100 importance ranking in all five folds), enriched targetable estrogen-signaling, proliferation, and epithelial-development programs, and connected ESR1/PGR with MYBL2/BIRC5/E2F8 through a consensus STRING network. Conclusions: The supervised divergence-guided representation provides a traceable, interpretable coordinate system that connects multi-omics models to key genes and pathways, positioning omics imaging as an interpretability interface that supports candidate biomarker and target discovery rather than a predictive shortcut.</w:t>
       </w:r>
     </w:p>
     <w:p>
@@ -443,7 +443,7 @@
           <w:b w:val="0"/>
           <w:sz w:val="22"/>
         </w:rPr>
-        <w:t>The contributions are: a JSD-guided center-spiral omics imaging framework; a systematic comparison of classical machine learning, MLP, FullSizeCNN, and multiple multi-omics fusion strategies; mean and standard deviation under strict five-fold cross-validation; key-factor visualization with SHAP, CNN saliency, and gene functional-category maps; and a scheme-2 functional-category masking experiment with equal-size random-masking controls to assess the contribution of each functional module to PAM50 classification and survival-risk modeling. Finally, we include an exploratory analysis of Hypoxia, ROS, OXPHOS, UPR, mTORC1, Glycolysis, EMT, and DNA-repair pathways to examine whether image-based key factors map onto tumor stress-adaptive programs.</w:t>
+        <w:t>The contributions are: a JSD-guided center-spiral omics imaging framework; a systematic comparison of classical machine learning, MLP, FullSizeCNN, and multiple multi-omics fusion strategies; mean and standard deviation under strict five-fold cross-validation; key-factor visualization with SHAP, CNN saliency, and gene functional-category maps; candidate biomarker and target discovery through the traceable gene-to-pixel attribution interface, and a scheme-2 functional-category masking experiment with equal-size random-masking controls to assess the contribution of each functional module to PAM50 classification and survival-risk modeling. Finally, we include an exploratory analysis of Hypoxia, ROS, OXPHOS, UPR, mTORC1, Glycolysis, EMT, and DNA-repair pathways to examine whether image-based key factors map onto tumor stress-adaptive programs.</w:t>
       </w:r>
     </w:p>
     <w:p>
@@ -564,7 +564,7 @@
           <w:b w:val="0"/>
           <w:sz w:val="22"/>
         </w:rPr>
-        <w:t>We used public TCGA-BRCA data from the Genomic Data Commons (GDC) and UCSC Xena. mRNA was the TCGA BRCA HiSeqV2 log2(RSEM+1) gene-expression matrix, CNV was rebuilt from GDC Gene Level Copy Number files (ASCAT2, ASCAT3, and ABSOLUTE LiftOver), with integer copy number discretized to GISTIC2-like values (0→-2, 1→-1, 2→0, 3→+1, ≥4→+2; missing→0), and miRNA was the miRNA expression matrix. Clinical labels included PAM50 subtype, vital status, and survival time. Primary tumor samples were selected by TCGA patient barcode, the three omics were intersected, and the -01 primary tumor sample was preferred per case. All data are public and de-identified, so no new patient sampling was involved; per-omics and intersection sample sizes are in Supplementary Table S1.</w:t>
+        <w:t>We used public TCGA-BRCA data from the Genomic Data Commons (GDC) and UCSC Xena. mRNA was the TCGA BRCA HiSeqV2 log2(RSEM+1) gene-expression matrix, CNV was rebuilt from GDC Gene Level Copy Number files (ASCAT2, ASCAT3, and ABSOLUTE LiftOver), with integer copy number discretized to copy-number states (0→-2, 1→-1, 2→0, 3→+1, ≥4→+2; missing→0). This standard integer discretization showed 50.6% exact agreement (Cohen’s κ=0.257, Pearson r=0.565) with the Xena GISTIC2 thresholded calls on overlapping samples, reflecting that integer-copy-number discretization and GISTIC2 thresholding are related but not identical., and miRNA was the miRNA expression matrix. Clinical labels included PAM50 subtype, vital status, and survival time. Primary tumor samples were selected by TCGA patient barcode, the three omics were intersected, and the -01 primary tumor sample was preferred per case. All data are public and de-identified, so no new patient sampling was involved; per-omics and intersection sample sizes are in Supplementary Table S1.</w:t>
       </w:r>
     </w:p>
     <w:p>
@@ -3935,7 +3935,7 @@
           <w:b w:val="0"/>
           <w:sz w:val="22"/>
         </w:rPr>
-        <w:t>SHAP for mRNA PAM50 LogisticRegression highlighted CYP2B7P1, TFF1, C1orf64, AGR3, KCNJ3, MIA, PPP1R14C, ESR1, and STAC2. Consensus genes between CNN saliency and SHAP included TCAM1P, MIA, SMC1B, PPP1R14C, KLK6, SLC6A11, FABP7, and FOXC1. Univariate survival Cox identified MS4A1, COL17A1, C2orf40, PLA2G2D, FABP7, CCL19, and GZMB. Pathway enrichment indicated estrogen signaling, proliferation, cell division, and epithelial development; the SHAP, saliency, consensus, survival-Cox, and enrichment figures are Supplementary Figures S5-S9.</w:t>
+        <w:t>SHAP for mRNA PAM50 LogisticRegression highlighted CYP2B7P1, TFF1, C1orf64, AGR3, KCNJ3, MIA, PPP1R14C, ESR1, and STAC2. Consensus genes between CNN saliency and SHAP included TCAM1P, MIA, SMC1B, PPP1R14C, KLK6, SLC6A11, FABP7, and FOXC1. Univariate survival Cox identified MS4A1, COL17A1, C2orf40, PLA2G2D, FABP7, CCL19, and GZMB. The top-20 SHAP genes appeared in the top-100 importance ranking in all five folds (fold frequency 5/5), indicating stable cross-fold attribution; pathway enrichment indicated targetable estrogen signaling, proliferation, cell division, and epithelial development. These stable, traceable factors constitute candidate biomarkers and therapeutic targets. The SHAP, saliency, consensus, survival-Cox, and enrichment figures are Supplementary Figures S5-S9.</w:t>
       </w:r>
     </w:p>
     <w:p>
@@ -4235,7 +4235,7 @@
           <w:b w:val="0"/>
           <w:sz w:val="22"/>
         </w:rPr>
-        <w:t>The advantage of JSD imaging is interpretability rather than maximal accuracy. By placing high-JSD genes centrally and drawing functional-category and saliency maps together, the attended convolutional regions map intuitively to key genes and pathways. This traceable, pixel-to-gene coordinate system is the core contribution, because it lets a reader move from a model-attended region directly to a biological entity.</w:t>
+        <w:t>The advantage of JSD imaging is interpretability rather than maximal accuracy. By placing high-JSD genes centrally and drawing functional-category and saliency maps together, the attended convolutional regions map intuitively to key genes and pathways. This traceable, pixel-to-gene coordinate system is the core contribution, because it lets a reader move from a model-attended region directly to a biological entity. From a biomarker and target discovery perspective, the stable, traceable factors (ESR1, PGR, FOXC1, MYBL2, BIRC5, TFF1, AGR3, and others) point to estrogen signaling, proliferation, and epithelial differentiation as candidate actionable modules, which aligns with the integrative multi-omics computational aim of nominating biomarkers and targets for further experimental validation.</w:t>
       </w:r>
     </w:p>
     <w:p>
@@ -4370,7 +4370,7 @@
           <w:b w:val="0"/>
           <w:sz w:val="22"/>
         </w:rPr>
-        <w:t>Limitations include a single retrospective TCGA-BRCA cohort; although METABRIC provides mRNA/CNV single-omics external validation, a complete external cohort with mRNA, CNV, and miRNA is still missing. Survival events are few and class-imbalanced; the spiral position is not a true biological space; and complex models may overfit. Statistically, the paired tests use only five fold-level scores, so power is limited and no multiple-comparison correction was applied; non-significant numerical differences (e.g., survival ROC AUC paired t p=0.093) should not be interpreted as evidence of no difference, and repeated CV, bootstrap confidence intervals, or fold-level effect sizes should be used to strengthen inference. Finally, the main analysis shares the same CV for feature-number selection and evaluation, so selection bias remains; the main multi-omics fusion analysis has not been fully re-evaluated under nested CV, and independent external validation is still necessary.</w:t>
+        <w:t>Limitations include a single retrospective TCGA-BRCA cohort; although METABRIC provides mRNA/CNV single-omics external validation, a complete external cohort with mRNA, CNV, and miRNA is still missing. Survival events are few and class-imbalanced; the spiral position is not a true biological space; and complex models may overfit. Statistically, the paired tests use only five fold-level scores, so power is limited and no multiple-comparison correction was applied; non-significant numerical differences (e.g., survival ROC AUC paired t p=0.097) should not be interpreted as evidence of no difference, and repeated CV, bootstrap confidence intervals, or fold-level effect sizes should be used to strengthen inference. Finally, the main analysis shares the same CV for feature-number selection and evaluation, so selection bias remains; the multi-omics fusion results are leak-free 5-fold estimates but have not been re-evaluated under fully nested CV, and independent external validation is still necessary. Survival modeling should be regarded as an auxiliary exploratory objective rather than a clinical prognostic tool, given the few death events and near-chance external discrimination. The rebuilt GDC gene-level CNV matrix and the miRNA matrix have slightly smaller sample coverage than the original cohort manifest, so the triple-omics intersections (486 PAM50, 725 survival) differ from the earlier 493/731 counts.</w:t>
       </w:r>
     </w:p>
     <w:p>

</xml_diff>

<commit_message>
Align manuscript to Molecular Stress Responses Research Topic 84735 (biomarker/target discovery theme)
</commit_message>
<xml_diff>
--- a/docs/Supervised_distribution_divergence_guided_omics_imaging_manuscript_Frontiers_EN.docx
+++ b/docs/Supervised_distribution_divergence_guided_omics_imaging_manuscript_Frontiers_EN.docx
@@ -8,7 +8,23 @@
         <w:ind w:firstLine="0"/>
         <w:jc w:val="center"/>
       </w:pPr>
-      <w:r/>
+      <w:r>
+        <w:t>Supervised distribution-divergence-guided omics imaging for interpretable multi-omics integration in breast cancer subtyping and survival-risk stratification</w:t>
+        <w:br/>
+      </w:r>
+      <w:r>
+        <w:t>a computational framework for candidate biomarker and target discovery</w:t>
+      </w:r>
+    </w:p>
+    <w:p>
+      <w:pPr>
+        <w:spacing w:after="120" w:line="240" w:lineRule="auto"/>
+        <w:ind w:firstLine="0"/>
+        <w:jc w:val="center"/>
+      </w:pPr>
+      <w:r>
+        <w:t>Running title: Supervised divergence-guided omics imaging</w:t>
+      </w:r>
       <w:r>
         <w:rPr>
           <w:rFonts w:ascii="Times New Roman" w:hAnsi="Times New Roman" w:eastAsia="宋体" w:cs="Times New Roman"/>
@@ -16,7 +32,6 @@
           <w:color w:val="0B2545"/>
           <w:sz w:val="32"/>
         </w:rPr>
-        <w:t>Supervised distribution-divergence-guided omics imaging for interpretable multi-omics integration in breast cancer subtyping and survival-risk stratification</w:t>
       </w:r>
     </w:p>
     <w:p>
@@ -33,6 +48,16 @@
           <w:sz w:val="20"/>
         </w:rPr>
         <w:t>Original Research</w:t>
+      </w:r>
+    </w:p>
+    <w:p>
+      <w:pPr>
+        <w:spacing w:after="160" w:line="240" w:lineRule="auto"/>
+        <w:ind w:firstLine="0"/>
+        <w:jc w:val="center"/>
+      </w:pPr>
+      <w:r>
+        <w:t>Manuscript word count: 6,247 (main text); Figures: 5; Tables: 3</w:t>
       </w:r>
     </w:p>
     <w:p>
@@ -229,7 +254,7 @@
         <w:jc w:val="both"/>
       </w:pPr>
       <w:r>
-        <w:t>Background: Breast cancer is highly heterogeneous, and a single molecular layer cannot robustly capture PAM50 subtypes or overall-survival risk. Multi-omics integration is theoretically complementary, yet is limited by high feature dimensionality, small sample sizes, heterogeneous scales, and the absence of natural two-dimensional adjacency among molecular features. Methods: We propose a supervised, distribution-divergence-guided omics spatial representation that scores the discriminative importance of each feature with the Jensen-Shannon divergence (JSD), arranges features by center-outward spiral filling into a single-channel grayscale image, and processes the image with a full-size convolutional network (FullSizeCNN). The representation is benchmarked against classical machine-learning models, an MLP, censoring-aware survival models (CoxPH, CoxNet, random survival forest), and multiple multi-omics fusion strategies using TCGA-BRCA mRNA, CNV, and miRNA, with leak-free five-fold cross-validation (feature selection and JSD ordering inside each fold) and external single-omics validation on METABRIC. Results: mRNA was the dominant signal for PAM50 subtype reconstruction (FullSizeCNN accuracy 0.869, LogisticRegression 0.822; CNV MLP 0.600; miRNA Dense 0.799). Death-status classifiers showed weak-to-moderate survival discrimination (C-index 0.55-0.62), while censoring-aware models reached up to 0.656 (miRNA random survival forest). For PAM50, multi-omics fusion (CNN late-average accuracy 0.842) did not exceed the best intersection single-omics mRNA model (0.852); for survival, CNN late-average fusion reached ROC AUC 0.674. A dense-equivalent control indicated that the two-dimensional layout itself did not add predictive gain, and the principal value of imaging is interpretability. The pixel-to-gene coordinate system recovered candidate biomarkers ESR1, TFF1, AGR3, FOXC1, MIA, FABP7, CCL19, and MS4A1 with stable cross-fold attribution (the top-20 SHAP genes appeared in the top-100 importance ranking in all five folds), enriched targetable estrogen-signaling, proliferation, and epithelial-development programs, and connected ESR1/PGR with MYBL2/BIRC5/E2F8 through a consensus STRING network. Conclusions: The supervised divergence-guided representation provides a traceable, interpretable coordinate system that connects multi-omics models to key genes and pathways, positioning omics imaging as an interpretability interface that supports candidate biomarker and target discovery rather than a predictive shortcut.</w:t>
+        <w:t>Background: Breast cancer is highly heterogeneous, and a single molecular layer cannot robustly capture PAM50 subtypes or overall-survival risk. Multi-omics integration is theoretically complementary, yet is limited by high feature dimensionality, small sample sizes, heterogeneous scales, and the absence of natural two-dimensional adjacency among molecular features. Methods: We propose a supervised, distribution-divergence-guided omics spatial representation that scores the discriminative importance of each feature with the Jensen-Shannon divergence (JSD), arranges features by center-outward spiral filling into a single-channel grayscale image, and processes the image with a full-size convolutional network (FullSizeCNN). The representation is benchmarked against classical machine-learning models, an MLP, censoring-aware survival models (CoxPH, CoxNet, random survival forest), and multiple multi-omics fusion strategies using TCGA-BRCA mRNA, CNV, and miRNA, with leak-free five-fold cross-validation (feature selection and JSD ordering inside each fold) and external single-omics validation on METABRIC. Results: mRNA was the dominant signal for PAM50 subtype reconstruction (FullSizeCNN accuracy 0.869, LogisticRegression 0.822; CNV MLP 0.600; miRNA Dense 0.799). Death-status classifiers showed weak-to-moderate survival discrimination (C-index ~0.50-0.64), while censoring-aware models reached up to 0.656 (miRNA random survival forest). For PAM50, multi-omics fusion (CNN late-average accuracy 0.842) did not exceed the best intersection single-omics mRNA model (0.852); for survival, CNN late-average fusion reached ROC AUC 0.674. A dense-equivalent control indicated that the two-dimensional layout itself did not add predictive gain, and the principal value of imaging is interpretability. The pixel-to-gene coordinate system recovered candidate biomarkers ESR1, TFF1, AGR3, FOXC1, MIA, FABP7, CCL19, and MS4A1 with stable cross-fold attribution (the top-20 SHAP genes from the LogisticRegression explainer appeared in the top-100 importance ranking in all five folds), enriched targetable estrogen-signaling, proliferation, and epithelial-development programs, and connected ESR1/PGR with MYBL2/BIRC5/E2F8 through a consensus STRING network. Independent METABRIC validation confirmed the subtype-specific expression of these candidates, and CCL19 and PGR retained significant survival associations after adjustment. Conclusions: The supervised divergence-guided representation provides a traceable, interpretable coordinate system that connects multi-omics models to key genes and pathways, positioning omics imaging as an interpretability interface that supports candidate biomarker prioritization and candidate target nomination rather than a predictive shortcut.</w:t>
       </w:r>
     </w:p>
     <w:p>
@@ -238,14 +263,8 @@
         <w:ind w:firstLine="0"/>
         <w:jc w:val="left"/>
       </w:pPr>
-      <w:r/>
       <w:r>
-        <w:rPr>
-          <w:rFonts w:ascii="Times New Roman" w:hAnsi="Times New Roman" w:eastAsia="宋体" w:cs="Times New Roman"/>
-          <w:b/>
-          <w:sz w:val="22"/>
-        </w:rPr>
-        <w:t>Keywords: breast cancer; multi-omics; omics imaging; Jensen-Shannon divergence; full-size convolution; PAM50; survival-risk stratification</w:t>
+        <w:t>Keywords: breast cancer; multi-omics; omics imaging; Jensen-Shannon divergence; PAM50; survival-risk stratification; biomarker discovery; adaptive reprogramming</w:t>
       </w:r>
     </w:p>
     <w:p>
@@ -273,12 +292,7 @@
         <w:jc w:val="both"/>
       </w:pPr>
       <w:r>
-        <w:rPr>
-          <w:rFonts w:ascii="Times New Roman" w:hAnsi="Times New Roman" w:eastAsia="宋体" w:cs="Times New Roman"/>
-          <w:b w:val="0"/>
-          <w:sz w:val="22"/>
-        </w:rPr>
-        <w:t>Breast cancer is among the most common malignancies in women. Its initiation, progression, and therapeutic response are governed by genetic, transcriptional, epigenetic, and microenvironmental layers, giving rise to marked molecular and clinical heterogeneity (Parker et al., 2009; Perou et al., 2000; Sørlie et al., 2001). Intrinsic molecular subtyping based on gene expression classifies breast cancer into Luminal A, Luminal B, Basal-like, HER2-enriched, and Normal-like subtypes, and the PAM50 gene set has become a standard tool for molecular subtyping and recurrence-risk estimation (Parker et al., 2009). Large-scale genomic studies have shown that the breast-cancer molecular landscape is shaped jointly by somatic mutations, copy-number variation (CNV), the transcriptome, and miRNAs (Cancer Genome Atlas Network, 2012; Curtis et al., 2012), and reproducible molecular subgroups exist even within triple-negative and invasive lobular carcinomas (Ciriello et al., 2015; Lehmann et al., 2011). Because overall survival (OS) directly reflects long-term outcome, simultaneously characterizing PAM50 subtypes and survival risk from multi-omics data has clear translational value.</w:t>
+        <w:t>Breast cancer is among the most common malignancies in women. Its initiation, progression, and therapeutic response are governed by genetic, transcriptional, epigenetic, and microenvironmental layers, giving rise to marked molecular and clinical heterogeneity (Parker et al., 2009; Perou et al., 2000; Sørlie et al., 2001). Intrinsic molecular subtyping based on gene expression classifies breast cancer into Luminal A, Luminal B, Basal-like, HER2-enriched, and Normal-like subtypes, and the PAM50 gene set has become a standard tool for molecular subtyping and recurrence-risk estimation (Parker et al., 2009). Large-scale genomic studies have shown that the breast-cancer molecular landscape is shaped jointly by somatic mutations, copy-number variation (CNV), the transcriptome, and miRNAs (Cancer Genome Atlas Network, 2012; Curtis et al., 2012), and reproducible molecular subgroups exist even within triple-negative and invasive lobular carcinomas (Ciriello et al., 2015; Lehmann et al., 2011). Tumor progression and therapeutic failure are also shaped by molecular stress responses and adaptive reprogramming, in which cancer cells co-opt oxidative, metabolic, proteotoxic, and replication-stress programs to survive therapy and thereby create candidate vulnerabilities (Hanahan and Weinberg, 2011; Luo et al., 2009). Because overall survival (OS) directly reflects long-term outcome, simultaneously characterizing PAM50 subtypes and survival risk from multi-omics data has clear translational value.</w:t>
       </w:r>
     </w:p>
     <w:p>
@@ -323,7 +337,7 @@
           <w:b w:val="0"/>
           <w:sz w:val="22"/>
         </w:rPr>
-        <w:t>At the classical machine-learning level, logistic regression, support vector machines, random forests, gradient boosting, and k-nearest neighbors have been widely applied to genomic and clinical prediction (Breiman, 2001; Cortes and Vapnik, 1995; Friedman, 2001), and remain baselines because of their interpretability, computational efficiency, and robustness on tabular data (Ching et al., 2018; Libbrecht and Noble, 2015; Zou et al., 2019). These methods usually take gene-expression or copy-number vectors directly as input and therefore cannot exploit spatial or network adjacency among features. Analogously, the progression from statistical models to classical machine learning and deep learning in ecological forecasting shows that model selection must jointly respect data structure and task objectives under data scarcity and interpretability constraints (Sui et al., 2026).</w:t>
+        <w:t>At the classical machine-learning level, logistic regression, support vector machines, random forests, gradient boosting, and k-nearest neighbors have been widely applied to genomic and clinical prediction (Breiman, 2001; Cortes and Vapnik, 1995; Friedman, 2001), and remain baselines because of their interpretability, computational efficiency, and robustness on tabular data (Ching et al., 2018; Libbrecht and Noble, 2015; Zou et al., 2019). These methods usually take gene-expression or copy-number vectors directly as input and therefore cannot exploit spatial or network adjacency among features.</w:t>
       </w:r>
     </w:p>
     <w:p>
@@ -438,12 +452,7 @@
         <w:jc w:val="both"/>
       </w:pPr>
       <w:r>
-        <w:rPr>
-          <w:rFonts w:ascii="Times New Roman" w:hAnsi="Times New Roman" w:eastAsia="宋体" w:cs="Times New Roman"/>
-          <w:b w:val="0"/>
-          <w:sz w:val="22"/>
-        </w:rPr>
-        <w:t>The contributions are: a JSD-guided center-spiral omics imaging framework; a systematic comparison of classical machine learning, MLP, FullSizeCNN, and multiple multi-omics fusion strategies; mean and standard deviation under strict five-fold cross-validation; key-factor visualization with SHAP, CNN saliency, and gene functional-category maps; candidate biomarker and target discovery through the traceable gene-to-pixel attribution interface, and a scheme-2 functional-category masking experiment with equal-size random-masking controls to assess the contribution of each functional module to PAM50 classification and survival-risk modeling. Finally, we include an exploratory analysis of Hypoxia, ROS, OXPHOS, UPR, mTORC1, Glycolysis, EMT, and DNA-repair pathways to examine whether image-based key factors map onto tumor stress-adaptive programs.</w:t>
+        <w:t>The contributions are: a JSD-guided center-spiral omics imaging framework; a systematic comparison of classical machine learning, MLP, FullSizeCNN, and multiple multi-omics fusion strategies; mean and standard deviation under strict five-fold cross-validation; key-factor visualization with SHAP, CNN saliency, and gene functional-category maps; candidate biomarker prioritization and candidate target nomination through the traceable gene-to-pixel attribution interface, and a Scheme 2 functional-category masking experiment with equal-size random-masking controls to assess the contribution of each functional module to PAM50 classification and survival-risk modeling. Finally, we include an exploratory pathway-level analysis of representative stress-adaptive marker-gene signatures (Hypoxia, ROS, OXPHOS, UPR, mTORC1, Glycolysis, EMT, and DNA repair) to examine whether image-based key factors map onto known cancer biological programs.</w:t>
       </w:r>
     </w:p>
     <w:p>
@@ -475,7 +484,7 @@
           <w:b w:val="0"/>
           <w:sz w:val="22"/>
         </w:rPr>
-        <w:t>This section gives only the core methods and parameters. Figure 1 shows the overall technical route and Table 1 summarizes sample sizes; the sample-level manifest is in Supplementary Table S1, feature-selection combinations in Table S2, and final feature counts in Table S3. Full single-omics results are in Table S4, intersection single-omics baselines in Table S5, triple-omics fusion in Table S6, pairwise fusion in Table S7, and stacking/complex methods in Tables S8-S9. Fusion statistical tests are in Table S10, imaging-structure comparisons in Tables S11-S13, the dense-equivalent baseline in Table S14 and Figure S3, and the random-permutation control in Table S15 and Figure S4. Interpretability figures are in Figures S5-S13, masking analyses in Tables S16-S21, the stress-pathway analysis in Table S22 and Figure S14, PAM50 50-gene exclusion in Table S23 and Figure S15, leak-free nested cross-validation in Table S24, strict PAM50 exclusion in Table S25, FullSizeCNN-Cox in Table S26, effect sizes in Table S27, method comparison in Table S28, METABRIC external validation in Table S29, gene-interaction analysis in S22, and community reordering in Table S30.</w:t>
+        <w:t>This section gives only the core methods and parameters. Figure 1 shows the overall technical route and Table 1 summarizes sample sizes; the sample-level manifest is in Supplementary Table S1, feature-selection combinations in Table S2, and final feature counts in Table S3. Full single-omics results are in Table S4, intersection single-omics baselines in Table S5, triple-omics fusion in Table S6, pairwise fusion in Table S7, and stacking/complex methods in Tables S8-S9. Fusion statistical tests are in Table S10, imaging-structure comparisons in Tables S11-S13, the dense-equivalent baseline in Table S14 and Figure S3, and the random-permutation control in Table S15 and Figure S4. Interpretability figures are in Figures S5-S13, masking analyses in Tables S16-S21, the pathway-enrichment analysis in Table S22 and Figure S14, PAM50 50-gene exclusion in Table S23 and Figure S15, leak-free nested cross-validation in Table S24, strict PAM50 exclusion in Table S25, FullSizeCNN-Cox in Table S26, effect sizes in Table S27, method comparison in Table S28, METABRIC external validation in Table S29, gene-interaction analysis in S22, community reordering in Table S30, perturbation-fidelity evaluation in Table S31 and Figure S16, and METABRIC candidate-gene replication in Table S32.</w:t>
       </w:r>
     </w:p>
     <w:p>
@@ -564,7 +573,7 @@
           <w:b w:val="0"/>
           <w:sz w:val="22"/>
         </w:rPr>
-        <w:t>We used public TCGA-BRCA data from the Genomic Data Commons (GDC) and UCSC Xena. mRNA was the TCGA BRCA HiSeqV2 log2(RSEM+1) gene-expression matrix, CNV was rebuilt from GDC Gene Level Copy Number files (ASCAT2, ASCAT3, and ABSOLUTE LiftOver), with integer copy number discretized to copy-number states (0→-2, 1→-1, 2→0, 3→+1, ≥4→+2; missing→0). This standard integer discretization showed 50.6% exact agreement (Cohen’s κ=0.257, Pearson r=0.565) with the Xena GISTIC2 thresholded calls on overlapping samples, reflecting that integer-copy-number discretization and GISTIC2 thresholding are related but not identical., and miRNA was the miRNA expression matrix. Clinical labels included PAM50 subtype, vital status, and survival time. Primary tumor samples were selected by TCGA patient barcode, the three omics were intersected, and the -01 primary tumor sample was preferred per case. All data are public and de-identified, so no new patient sampling was involved; per-omics and intersection sample sizes are in Supplementary Table S1.</w:t>
+        <w:t>We used public TCGA-BRCA data from the Genomic Data Commons (GDC) and UCSC Xena. mRNA was the TCGA BRCA HiSeqV2 log2(RSEM+1) gene-expression matrix, CNV was rebuilt from GDC Gene Level Copy Number files (ASCAT2, ASCAT3, and ABSOLUTE LiftOver), with integer copy number discretized to copy-number states (0→-2, 1→-1, 2→0, 3→+1, ≥4→+2; missing→0). This standard integer discretization showed 50.6% exact agreement (Cohen’s κ=0.257, Pearson r=0.565) with the Xena GISTIC2 thresholded calls on overlapping samples, reflecting that integer-copy-number discretization and GISTIC2 thresholding are related but not identical, and miRNA was the miRNA expression matrix. Clinical labels included PAM50 subtype, vital status, and survival time. Primary tumor samples were selected by TCGA patient barcode, the three omics were intersected, and the -01 primary tumor sample was preferred per case. All data are public and de-identified, so no new patient sampling was involved; per-omics and intersection sample sizes are in Supplementary Table S1.</w:t>
       </w:r>
     </w:p>
     <w:p>
@@ -1125,7 +1134,7 @@
           <w:b w:val="0"/>
           <w:sz w:val="22"/>
         </w:rPr>
-        <w:t>Except for CoxPH and DeepSurv, which are time-to-event models, all other models (LogisticRegression, SVC, RandomForest, MLP, FullSizeCNN, etc.) fit the OS event with binary cross-entropy and are therefore mortality-status classifiers; their output is used as a continuous risk score and combined with survival time to compute the C-index for survival-ranking evaluation. Hence, our 'survival-risk modeling' is not equivalent to strict hazard-rate modeling.</w:t>
+        <w:t>Except for CoxPH, CoxNet, random survival forest, and DeepSurv, which are time-to-event models, all other models (LogisticRegression, SVC, RandomForest, MLP, FullSizeCNN, etc.) fit the OS event with binary cross-entropy and are therefore mortality-status classifiers; their output is used as a continuous risk score and combined with survival time to compute the C-index for survival-ranking evaluation. Hence, our 'survival-risk modeling' is not equivalent to strict hazard-rate modeling.</w:t>
       </w:r>
     </w:p>
     <w:p>
@@ -1302,7 +1311,7 @@
           <w:b w:val="0"/>
           <w:sz w:val="22"/>
         </w:rPr>
-        <w:t>To improve the biological meaning of pixel adjacency, scheme 2 first groups features by functional category, sorts within each block by descending JSD, and fills blocks by their mean JSD from the center outward. mRNA and CNV categories came from gene functional annotations; miRNA was mapped by MIMAT to hsa-miR names and then assigned by family or known function. This yields a functional-category map aligned pixel-wise with the expression and JSD maps. The complete feature-to-category mapping, including source database identifiers (gene symbol, MIMAT, and category rules), is provided in the machine-readable file omics_functional_category_annotation.tsv, and CNV/miRNA categories are treated as heuristic annotations rather than mutually exclusive biological ontologies.  Key hormone and proliferation genes are now assigned to their functional groups (e.g., ESR1/PGR to Hormone/Metabolism, E2F8/BIRC5 to Cell cycle/Proliferation, FOXC1/KRT to Development/Epithelium), and the annotation is provided as a multi-label GO:BP/Reactome table (mRNA_functional_category_annotation.tsv). The categories are intended as visualization-aided grouping rather than a strict biological module definition. In masking experiments, the target category pixels were set to zero, FullSizeCNN was retrained, and performance was compared with the unmasked baseline and equal-size random-gene masks.</w:t>
+        <w:t>To improve the biological meaning of pixel adjacency, Scheme 2 first groups features by functional category, sorts within each block by descending JSD, and fills blocks by their mean JSD from the center outward. mRNA and CNV categories came from gene functional annotations; miRNA was mapped by MIMAT to hsa-miR names and then assigned by family or known function. This yields a functional-category map aligned pixel-wise with the expression and JSD maps. The complete feature-to-category mapping, including source database identifiers (gene symbol, MIMAT, and category rules), is provided in the machine-readable file omics_functional_category_annotation.tsv, and CNV/miRNA categories are treated as heuristic annotations rather than mutually exclusive biological ontologies.  Key hormone and proliferation genes are now assigned to their functional groups (e.g., ESR1/PGR to Hormone/Metabolism, E2F8/BIRC5 to Cell cycle/Proliferation, FOXC1/KRT to Development/Epithelium), and the annotation is provided as a multi-label GO:BP/Reactome table (mRNA_functional_category_annotation.tsv). The categories are intended as visualization-aided grouping rather than a strict biological module definition. In masking experiments, the target category pixels were set to zero, FullSizeCNN was retrained, and performance was compared with the unmasked baseline and equal-size random-gene masks.</w:t>
       </w:r>
     </w:p>
     <w:p>
@@ -2953,7 +2962,7 @@
           <w:b w:val="0"/>
           <w:sz w:val="22"/>
         </w:rPr>
-        <w:t>Table 3 summarizes the best model per task and Figure 3A shows all compared models as mean ± SD under leak-free five-fold cross-validation (feature selection, scaling, and JSD ordering inside each fold). mRNA was the strongest signal for PAM50 subtype reconstruction, followed by miRNA and then CNV; all single-omics survival models showed near-chance discrimination (C-index 0.56-0.62).</w:t>
+        <w:t>Table 3 summarizes the best model per task and Figure 3A shows all compared models as mean ± SD under leak-free five-fold cross-validation (feature selection, scaling, and JSD ordering inside each fold). mRNA was the strongest signal for PAM50 subtype reconstruction, followed by miRNA and then CNV; single-omics survival models showed weak-to-moderate discrimination, ranging from near-chance for CNV (C-index down to ~0.50) to 0.656 for miRNA random survival forest.</w:t>
       </w:r>
     </w:p>
     <w:p>
@@ -3747,7 +3756,7 @@
           <w:color w:val="555555"/>
           <w:sz w:val="18"/>
         </w:rPr>
-        <w:t>Figure 3. Prediction performance under leak-free five-fold cross-validation (feature selection and JSD ordering inside each training fold). A: single-omics prediction on full samples (PAM50 Accuracy and Macro-F1; survival ROC AUC and C-index; PAM50 sample sizes mRNA 832, CNV 826, miRNA 492; survival mRNA 1072, CNV 1067, miRNA 734). B: triple-omics fusion performance (PAM50 intersection n=486; survival n=725). C: advanced integration methods Transformer and DeepSurv (n=486 PAM50, 725 survival; DeepSurv has no PAM50 output). Bars show 5-fold CV mean ± SD.</w:t>
+        <w:t>Figure 3. Prediction performance under leak-free five-fold cross-validation (feature selection and JSD ordering inside each training fold). A: single-omics prediction on full samples (PAM50 Accuracy and Macro-F1; survival ROC AUC and C-index; PAM50 sample sizes mRNA 832, CNV 826, miRNA 492; survival mRNA 1072, CNV 1067, miRNA 734). B: triple-omics fusion performance as a heatmap (fusion schemes × PAM50 Accuracy and Survival ROC AUC; PAM50 n=486, survival n=725). C: advanced integration methods as a heatmap (Transformer and DeepSurv × PAM50 Accuracy/Macro-F1 and Survival ROC AUC/C-index; DeepSurv has no PAM50 output). Heatmap colors are normalized per column, and cells show the 5-fold CV mean; SD is reported in Supplementary Tables S6 and S9.</w:t>
       </w:r>
     </w:p>
     <w:p>
@@ -3794,7 +3803,7 @@
           <w:b w:val="0"/>
           <w:sz w:val="22"/>
         </w:rPr>
-        <w:t>For survival-risk modeling, CNN late-average fusion reached ROC AUC 0.6742±0.0385, modestly above the best single-omics models; Concat MLP reached 0.6410±0.0504, while gated attention (0.6255±0.0399) and Concat LogisticRegression (0.6234±0.0382) were lower. The survival gain was modest and was not formally tested against all single-omics models.</w:t>
+        <w:t>For survival-risk modeling, CNN late-average fusion reached ROC AUC 0.6742±0.0385, numerically above the best single-omics model on the same intersection (miRNA RandomForest, 0.6634±0.0909); Concat MLP reached 0.6410±0.0504, while gated attention (0.6255±0.0399) and Concat LogisticRegression (0.6234±0.0382) were lower. The survival gain over the best single omics was small and not statistically significant (see the paired tests below).</w:t>
       </w:r>
     </w:p>
     <w:p>
@@ -3841,7 +3850,7 @@
           <w:b w:val="0"/>
           <w:sz w:val="22"/>
         </w:rPr>
-        <w:t>Pairwise, stacking, and complex-method results below are exploratory estimates based on cohort-level pre-selected features and have not yet been recomputed under leak-free cross-validation. For pairwise fusion, PAM50 mRNA+CNV LogisticRegression reached Accuracy 0.9633±0.0039, mRNA+miRNA LogisticRegression 0.9095, and CNV+miRNA LogisticRegression 0.8438. For survival-risk modeling, mRNA+CNV Concat MLP reached C-index 0.7451, mRNA+miRNA Concat MLP 0.7337, and CNV+miRNA CNN LateAvg 0.7216. Nine-model stacking reached PAM50 Accuracy 0.9229, survival C-index 0.7321, and ROC AUC 0.7469, without stably exceeding the best simple fusion. Pairwise and nine-model stacking results are detailed in Supplementary Tables S7 and S8.</w:t>
+        <w:t>Pairwise fusion and nine-model stacking were recomputed under the same leak-free five-fold cross-validation (feature selection, scaling, and JSD ordering inside each training fold), each on its own sample intersection. For PAM50, pairwise fusion was comparable to the best single omics: mRNA+CNV CNN late-average reached Accuracy 0.8667±0.0184 (n=825), mRNA+miRNA CNN late-average 0.8414±0.0537 (n=492), and CNV+miRNA Concat LogisticRegression 0.7879±0.0464 (n=486). For survival-risk modeling, pairwise CNN late-average reached ROC AUC 0.6608±0.0497 (CNV+miRNA, n=727) and 0.6342±0.0704 (mRNA+miRNA, n=732). Nine-model stacking reached PAM50 Accuracy 0.8518±0.0339 (Macro-F1 0.8218±0.0270) and survival ROC AUC 0.6683±0.0435 (C-index 0.6100±0.0561) on the triple-omics intersection. Paired tests on the same folds found no significant advantage of stacking over the best single omics or the simple triple-omics fusion (PAM50 stacking versus mRNA RandomForest p=0.995, versus CNN late-average p=0.090; survival stacking versus CNN late-average p=0.507, versus miRNA RandomForest p=0.931). Pairwise and nine-model stacking results are detailed in Supplementary Tables S7 and S8.</w:t>
       </w:r>
     </w:p>
     <w:p>
@@ -3888,7 +3897,7 @@
           <w:b w:val="0"/>
           <w:sz w:val="22"/>
         </w:rPr>
-        <w:t>Paired tests between the best fusion and the best intersection single-omics on the same folds and the same 486/725 patients are in Supplementary Table S10. For PAM50, CNN late-average fusion versus mRNA RandomForest had an Accuracy difference of -0.0104 (paired t p=0.6531, Wilcoxon p=0.6250), and Concat MLP versus mRNA RandomForest had a difference of -0.0166 (p=0.5412, Wilcoxon p=0.6250). For survival, CNN late-average fusion versus mRNA RandomForest had a ROC AUC difference of +0.0901 (paired t p=0.0966, Wilcoxon p=0.0625), and Concat MLP versus mRNA RandomForest had a difference of +0.0570 (p=0.1659, Wilcoxon p=0.3125). Thus no fusion strategy reached a statistically significant advantage over the best single-omics counterpart at the 0.05 threshold.</w:t>
+        <w:t>Paired tests between the best fusion and the best intersection single-omics on the same folds and the same 486/725 patients are in Supplementary Table S10. The best single-omics model was selected as the highest mean metric among single-omics models on the same intersection (mRNA RandomForest for PAM50 Accuracy; miRNA RandomForest for Survival ROC AUC). For PAM50, CNN late-average fusion versus mRNA RandomForest had an Accuracy difference of -0.0104 (paired t p=0.6531, Wilcoxon p=0.6250), and Concat MLP versus mRNA RandomForest had a difference of -0.0166 (p=0.5412, Wilcoxon p=0.6250). For survival, CNN late-average fusion versus miRNA RandomForest had a ROC AUC difference of +0.0107 (paired t p=0.8519, Wilcoxon p=1.0000), and Concat MLP versus miRNA RandomForest had a difference of -0.0224 (p=0.6333, Wilcoxon p=0.8125). Thus no fusion strategy reached a statistically significant advantage over the best single-omics counterpart at the 0.05 threshold.</w:t>
       </w:r>
     </w:p>
     <w:p>
@@ -3935,7 +3944,7 @@
           <w:b w:val="0"/>
           <w:sz w:val="22"/>
         </w:rPr>
-        <w:t>SHAP for mRNA PAM50 LogisticRegression highlighted CYP2B7P1, TFF1, C1orf64, AGR3, KCNJ3, MIA, PPP1R14C, ESR1, and STAC2. Consensus genes between CNN saliency and SHAP included TCAM1P, MIA, SMC1B, PPP1R14C, KLK6, SLC6A11, FABP7, and FOXC1. Univariate survival Cox identified MS4A1, COL17A1, C2orf40, PLA2G2D, FABP7, CCL19, and GZMB. The top-20 SHAP genes appeared in the top-100 importance ranking in all five folds (fold frequency 5/5), indicating stable cross-fold attribution; pathway enrichment indicated targetable estrogen signaling, proliferation, cell division, and epithelial development. These stable, traceable factors constitute candidate biomarkers and therapeutic targets. The SHAP, saliency, consensus, survival-Cox, and enrichment figures are Supplementary Figures S5-S9.</w:t>
+        <w:t>SHAP for mRNA PAM50 LogisticRegression highlighted CYP2B7P1, TFF1, C1orf64, AGR3, KCNJ3, MIA, PPP1R14C, ESR1, and STAC2. Consensus genes between CNN saliency and SHAP included TCAM1P, MIA, SMC1B, PPP1R14C, KLK6, SLC6A11, FABP7, and FOXC1. Univariate survival Cox identified MS4A1, COL17A1, C2orf40, PLA2G2D, FABP7, CCL19, and GZMB. The top-20 SHAP genes appeared in the top-100 importance ranking in all five folds (fold frequency 5/5), indicating stable cross-fold attribution; pathway enrichment indicated targetable estrogen signaling, proliferation, cell division, and epithelial development. These stable, traceable factors constitute candidate biomarkers and candidate targets to be validated. The SHAP, saliency, consensus, survival-Cox, and enrichment figures are Supplementary Figures S5-S9.</w:t>
       </w:r>
     </w:p>
     <w:p>
@@ -3982,7 +3991,7 @@
           <w:b w:val="0"/>
           <w:sz w:val="22"/>
         </w:rPr>
-        <w:t>To explain the contribution of different functional regions, we masked functional categories on the scheme-2 images. Unlike the original global JSD ordering, scheme 2 groups features by category, sorts within blocks by JSD, and fills blocks by mean importance from the center outward, so each color region corresponds to one functional module and the center holds high-JSD modules. Figure 4B shows the masking workflow; the complete workflow and per-omics masking performance are in Supplementary Figures S10–S13.</w:t>
+        <w:t>To explain the contribution of different functional regions, we masked functional categories on the Scheme 2 images. Unlike the original global JSD ordering, Scheme 2 groups features by category, sorts within blocks by JSD, and fills blocks by mean importance from the center outward, so each color region corresponds to one functional module and the center holds high-JSD modules. Figure 4B shows the masking workflow; the complete workflow and per-omics masking performance are in Supplementary Figures S10–S13.</w:t>
       </w:r>
     </w:p>
     <w:p>
@@ -3997,7 +4006,7 @@
           <w:b w:val="0"/>
           <w:sz w:val="22"/>
         </w:rPr>
-        <w:t>For mRNA, PAM50 baseline Accuracy was 0.9244±0.0124 and Macro-F1 0.9069±0.0133; masking Other reduced Macro-F1 to 0.8819±0.0210. mRNA survival baseline C-index was 0.6984±0.0756 and fell to 0.6757±0.0715 after masking Other. CNV and miRNA likewise showed the largest drop after masking Other, but because Other has the most features, the drop also reflects module size. Figure 4C shows the masking delta heatmap for mRNA, CNV, and miRNA; mRNA results are in Supplementary Table S16 and CNV/miRNA in Table S17.</w:t>
+        <w:t>These masking analyses use cohort-level pre-selected features and JSD ordering and are therefore exploratory; accordingly, the mRNA PAM50 baseline Accuracy reported here (0.9244) is higher than the leak-free full-sample estimate (0.8690). For mRNA, PAM50 baseline Accuracy was 0.9244±0.0124 and Macro-F1 0.9069±0.0133; masking Other reduced Macro-F1 to 0.8819±0.0210. mRNA survival baseline C-index was 0.6984±0.0756 and fell to 0.6757±0.0715 after masking Other. CNV and miRNA likewise showed the largest drop after masking Other, but because Other has the most features, the drop also reflects module size. Figure 4C shows the masking delta heatmap for mRNA, CNV, and miRNA; mRNA results are in Supplementary Table S16 and CNV/miRNA in Table S17.</w:t>
       </w:r>
     </w:p>
     <w:p>
@@ -4069,7 +4078,7 @@
           <w:color w:val="555555"/>
           <w:sz w:val="18"/>
         </w:rPr>
-        <w:t>Figure 4. Interpretability and functional-category masking. A: mRNA PAM50 attribution maps (A1 SHAP importance, A2 CNN saliency, A3 expression–saliency overlay). B: scheme-2 masking workflow (B1 before masking, B2 functional category map, B3 after masking; B4 flow diagram). C: functional-category masking delta heatmap for mRNA, CNV, and miRNA (red, decrease; blue, increase). 5-fold cross-validation SD is reported in Supplementary Tables S16–S17.</w:t>
+        <w:t>Figure 4. Interpretability and functional-category masking. A: mRNA PAM50 attribution maps (A1 SHAP importance, A2 CNN saliency, A3 expression–saliency overlay). B: Scheme 2 masking workflow (B1 before masking, B2 functional category map, B3 after masking; B4 flow diagram). C: functional-category masking delta heatmap for mRNA, CNV, and miRNA (red, decrease; blue, increase). Masking analyses use cohort-level pre-selected features (exploratory); 5-fold cross-validation SD is reported in Supplementary Tables S16–S17.</w:t>
       </w:r>
     </w:p>
     <w:p>
@@ -4158,7 +4167,7 @@
           <w:color w:val="555555"/>
           <w:sz w:val="18"/>
         </w:rPr>
-        <w:t>Figure 5. Gene interaction analysis. A: consensus-gene STRING PPI; B: mRNA co-expression communities; C: top miRNA-mRNA negative correlations; D: top CNV-mRNA correlations. The community-informed ordering is compared with the JSD spiral ordering in Supplementary Table S30.</w:t>
+        <w:t>Figure 5. Gene interaction analysis. A: consensus-gene STRING PPI (hub genes ESR1, PGR, MYBL2, BIRC5, E2F8 in red); B: mRNA co-expression of the top 40 genes, hierarchically clustered; C: top 20 miRNA-mRNA negative correlations; D: top 20 CNV-mRNA correlations. The community-informed ordering is compared with the JSD spiral ordering in Supplementary Table S30.</w:t>
       </w:r>
     </w:p>
     <w:p>
@@ -4235,7 +4244,7 @@
           <w:b w:val="0"/>
           <w:sz w:val="22"/>
         </w:rPr>
-        <w:t>The advantage of JSD imaging is interpretability rather than maximal accuracy. By placing high-JSD genes centrally and drawing functional-category and saliency maps together, the attended convolutional regions map intuitively to key genes and pathways. This traceable, pixel-to-gene coordinate system is the core contribution, because it lets a reader move from a model-attended region directly to a biological entity. From a biomarker and target discovery perspective, the stable, traceable factors (ESR1, PGR, FOXC1, MYBL2, BIRC5, TFF1, AGR3, and others) point to estrogen signaling, proliferation, and epithelial differentiation as candidate actionable modules, which aligns with the integrative multi-omics computational aim of nominating biomarkers and targets for further experimental validation.</w:t>
+        <w:t>The advantage of JSD imaging is interpretability rather than maximal accuracy. By placing high-JSD genes centrally and drawing functional-category and saliency maps together, the attended convolutional regions map intuitively to key genes and pathways. This traceable, pixel-to-gene coordinate system is the core contribution, because it lets a reader move from a model-attended region directly to a biological entity. From a candidate biomarker prioritization and candidate target nomination perspective, the stable, traceable factors (ESR1, PGR, FOXC1, MYBL2, BIRC5, TFF1, AGR3, and others) point to estrogen signaling, proliferation, and epithelial differentiation as candidate actionable modules, which aligns with the integrative multi-omics computational aim of nominating biomarkers and targets for further experimental validation. A perturbation-fidelity control quantified this: for mRNA PAM50, JSD ordering gave a lower deletion AUC than random ordering (LogisticRegression 0.651 vs 0.666, paired t p=0.107; FullSizeCNN 0.776 vs 0.789, paired t p=0.022), whereas model-native attributions were the most faithful (SHAP 0.611; saliency 0.674). With only five fold-level observations this evidence is suggestive rather than definitive, and it confirms that imaging's value is the traceable coordinate system rather than superior attribution accuracy (Figure S16, Table S31). Independent METABRIC replication further supported these candidates: ESR1, TFF1, AGR3, and PGR remained strongly Luminal-enriched and FOXC1, MIA, and FABP7 remained Basal-enriched, while CCL19 (HR 0.85, p=4.2e-6), PGR (HR 0.87, p=1.8e-6), BIRC5 (HR 1.13, p=3.4e-5), and E2F8 (HR 1.08, p=6.8e-3) showed univariable survival associations that survived BH-FDR correction; after adjustment for age, Nottingham Prognostic Index, and subtype, CCL19 (HR 0.89, p=1.0e-3) and PGR (HR 0.93, p=2.2e-2) remained significant, whereas BIRC5 and E2F8 did not. These are independent univariable (and partly multivariable) associations rather than proof of clinical independent prognostic value, supporting candidate biomarker prioritisation rather than novel target discovery (Table S32).</w:t>
       </w:r>
     </w:p>
     <w:p>
@@ -4250,7 +4259,7 @@
           <w:b w:val="0"/>
           <w:sz w:val="22"/>
         </w:rPr>
-        <w:t>To test whether the two-dimensional structure itself adds anything, we trained a dense-equivalent baseline (Flatten→Dense(32)→Dense(64)→output) with the same first-layer parameter count as the full-size kernel. The dense baseline was comparable to FullSizeCNN under leak-free evaluation (PAM50 mRNA 0.8593 versus 0.8690; CNV 0.6238 versus 0.6162; miRNA 0.7989 versus 0.7785) and was similar on survival C-index. The discriminative information therefore comes mainly from the raw feature values, not from the imposed two-dimensional adjacency; the imaging interface mainly supports attribution.</w:t>
+        <w:t>To test whether the two-dimensional structure itself adds anything, we trained a dense-equivalent baseline (Flatten→Dense(32)→Dense(64)→output) with the same first-layer parameter count as the full-size kernel. The dense baseline was comparable to FullSizeCNN under leak-free evaluation (PAM50 mRNA 0.8593 versus 0.8690; CNV 0.5848 versus 0.5945; miRNA 0.7989 versus 0.7785) and was similar on survival C-index. The discriminative information therefore comes mainly from the raw feature values, not from the imposed two-dimensional adjacency; the imaging interface mainly supports attribution.</w:t>
       </w:r>
     </w:p>
     <w:p>
@@ -4320,12 +4329,7 @@
         <w:jc w:val="both"/>
       </w:pPr>
       <w:r>
-        <w:rPr>
-          <w:rFonts w:ascii="Times New Roman" w:hAnsi="Times New Roman" w:eastAsia="宋体" w:cs="Times New Roman"/>
-          <w:b w:val="0"/>
-          <w:sz w:val="22"/>
-        </w:rPr>
-        <w:t>Consistent with the focus on molecular stress responses and adaptive reprogramming, we examined Hypoxia, ROS, OXPHOS, UPR, mTORC1, Glycolysis, EMT, and DNA-repair pathways against JSD high-importance genes, PAM50 subtypes, and survival. None of these pathways was nominally enriched among the top-500 JSD genes (Fisher p after BH-FDR correction was not significant), and univariate Cox found no pathway score associated with overall survival. Pathway scores differed strongly across PAM50 subtypes (Kruskal-Wallis p&lt;0.001), which is expected when subtypes are defined by expression. We therefore treat these as exploratory negative findings under bulk expression and compact signatures, and suggest validation in single-cell, spatial transcriptomic, or perturbation settings.</w:t>
+        <w:t>As an additional pathway-level biological annotation, we examined Hypoxia, ROS, OXPHOS, UPR, mTORC1, Glycolysis, EMT, and DNA-repair marker-gene signatures against JSD high-importance genes, PAM50 subtypes, and survival. None of these pathways was nominally enriched among the top-500 JSD genes (Fisher p after BH-FDR correction was not significant), and univariate Cox found no pathway score associated with overall survival. Pathway scores differed strongly across PAM50 subtypes (Kruskal-Wallis p&lt;0.001), which is expected when subtypes are defined by expression. We therefore treat these as exploratory negative findings under bulk expression and compact signatures, and suggest validation in single-cell, spatial transcriptomic, or perturbation settings. From a stress-adaptation perspective, these negative results do not exclude a role for stress responses in breast-cancer biology; they indicate that compact marker-gene signatures do not resolve such programs at bulk-transcriptome resolution in this cohort, and they motivate single-cell, spatial, or perturbation-based follow-up.</w:t>
       </w:r>
     </w:p>
     <w:p>
@@ -4340,7 +4344,7 @@
           <w:b w:val="0"/>
           <w:sz w:val="22"/>
         </w:rPr>
-        <w:t>Compared with existing table-to-image representations, DeepInsight lays out features with unsupervised t-SNE, DeepInsight-3D extends this to multi-omics, and Yan et al. use transcriptomic feature maps for cancer-type and survival prediction (Sharma et al., 2019; Sharma et al., 2023; Yan et al., 2025); SurvConvMixer uses pathway-level expression images (Wang et al., 2024), and MoACNN-XGNet builds an interpretable multi-omics CNN for breast-cancer subtyping (Li et al., 2025). Our framework differs in two ways: it uses supervised JSD rather than unsupervised dimensionality reduction to guide the layout and binds expression, importance, function, and attention into one traceable coordinate system; and its dense-equivalent and random-permutation controls show that the 2-D layout itself does not add predictive gain at this data scale. This complements rather than contradicts the DeepInsight motivation: spatial structure is more likely to help when larger samples or a genuine spatial prior (such as a pathway network) are available.</w:t>
+        <w:t>Compared with existing table-to-image representations, DeepInsight lays out features with unsupervised t-SNE, DeepInsight-3D extends this to multi-omics, and Yan et al. use transcriptomic feature maps for cancer-type and survival prediction (Sharma et al., 2019; Sharma et al., 2023; Yan et al., 2025); SurvConvMixer uses pathway-level expression images (Wang et al., 2024), and MoACNN-XGNet builds an interpretable multi-omics CNN for breast-cancer subtyping (Li et al., 2026). Our framework differs in two ways: it uses supervised JSD rather than unsupervised dimensionality reduction to guide the layout and binds expression, importance, function, and attention into one traceable coordinate system; and its dense-equivalent and random-permutation controls show that the 2-D layout itself does not add predictive gain at this data scale. This complements rather than contradicts the DeepInsight motivation: spatial structure is more likely to help when larger samples or a genuine spatial prior (such as a pathway network) are available.</w:t>
       </w:r>
     </w:p>
     <w:p>
@@ -4370,7 +4374,7 @@
           <w:b w:val="0"/>
           <w:sz w:val="22"/>
         </w:rPr>
-        <w:t>Limitations include a single retrospective TCGA-BRCA cohort; although METABRIC provides mRNA/CNV single-omics external validation, a complete external cohort with mRNA, CNV, and miRNA is still missing. Survival events are few and class-imbalanced; the spiral position is not a true biological space; and complex models may overfit. Statistically, the paired tests use only five fold-level scores, so power is limited and no multiple-comparison correction was applied; non-significant numerical differences (e.g., survival ROC AUC paired t p=0.097) should not be interpreted as evidence of no difference, and repeated CV, bootstrap confidence intervals, or fold-level effect sizes should be used to strengthen inference. Finally, the main analysis shares the same CV for feature-number selection and evaluation, so selection bias remains; the multi-omics fusion results are leak-free 5-fold estimates but have not been re-evaluated under fully nested CV, and independent external validation is still necessary. Survival modeling should be regarded as an auxiliary exploratory objective rather than a clinical prognostic tool, given the few death events and near-chance external discrimination. The rebuilt GDC gene-level CNV matrix and the miRNA matrix have slightly smaller sample coverage than the original cohort manifest, so the triple-omics intersections (486 PAM50, 725 survival) differ from the earlier 493/731 counts.</w:t>
+        <w:t>Limitations include a single retrospective TCGA-BRCA cohort; although METABRIC provides mRNA/CNV single-omics external validation, a complete external cohort with mRNA, CNV, and miRNA is still missing. Survival events are few and class-imbalanced; the spiral position is not a true biological space; and complex models may overfit. Statistically, the paired tests use only five fold-level scores, so power is limited and no multiple-comparison correction was applied; non-significant numerical differences (e.g., survival ROC AUC paired t p=0.852) should not be interpreted as evidence of no difference, and repeated CV, bootstrap confidence intervals, or fold-level effect sizes should be used to strengthen inference. Finally, the main analysis shares the same CV for feature-number selection and evaluation, so selection bias remains; the multi-omics fusion results are leak-free 5-fold estimates but have not been re-evaluated under fully nested CV, and independent external validation is still necessary. Survival modeling should be regarded as an auxiliary exploratory objective rather than a clinical prognostic tool, given the few death events and near-chance external discrimination. The rebuilt GDC gene-level CNV matrix and the miRNA matrix have slightly smaller sample coverage than the original cohort manifest, so the triple-omics intersections (486 PAM50, 725 survival) differ from the earlier 493/731 counts.</w:t>
       </w:r>
     </w:p>
     <w:p>
@@ -4412,12 +4416,7 @@
         <w:jc w:val="both"/>
       </w:pPr>
       <w:r>
-        <w:rPr>
-          <w:rFonts w:ascii="Times New Roman" w:hAnsi="Times New Roman" w:eastAsia="宋体" w:cs="Times New Roman"/>
-          <w:b w:val="0"/>
-          <w:sz w:val="22"/>
-        </w:rPr>
-        <w:t>We established a JSD-guided omics imaging and multi-omics fusion framework that supports both breast-cancer PAM50 subtype reconstruction and survival-risk ranking. mRNA was the strongest single omics for subtype reconstruction, and its discriminative information was not driven mainly by the canonical PAM50 panel. Multi-omics fusion showed numerical but not statistically significant gains for survival-risk modeling, pointing to complementary information that requires independent validation. FullSizeCNN provides a lightweight, interpretable baseline for omics imaging. Future work should validate on external multi-omics cohorts and explore more robust fusion strategies.</w:t>
+        <w:t>We established a JSD-guided omics imaging and multi-omics fusion framework that supports both breast-cancer PAM50 subtype reconstruction and survival-risk ranking. mRNA was the strongest single omics for subtype reconstruction, and its discriminative information was not driven mainly by the canonical PAM50 panel. Multi-omics fusion showed numerical but not statistically significant gains for survival-risk modeling, pointing to complementary information that requires independent validation. FullSizeCNN provides a lightweight, interpretable baseline for omics imaging. Future work should validate on external multi-omics cohorts, resolve stress-adaptive programs at single-cell or spatial resolution, and explore more robust fusion strategies.</w:t>
       </w:r>
     </w:p>
     <w:p>
@@ -4526,19 +4525,6 @@
           <w:rFonts w:ascii="Times New Roman" w:hAnsi="Times New Roman" w:eastAsia="宋体" w:cs="Times New Roman"/>
           <w:sz w:val="21"/>
         </w:rPr>
-        <w:t>Chen, S., Navickas, A., and Goodarzi, H. (2024). Translational adaptation in breast cancer metastasis and emerging therapeutic opportunities. Trends Pharmacol Sci. 45(4):304-318. doi:10.1016/j.tips.2024.02.002.</w:t>
-      </w:r>
-    </w:p>
-    <w:p>
-      <w:pPr>
-        <w:spacing w:after="80" w:line="240" w:lineRule="auto"/>
-        <w:ind w:left="0" w:firstLine="0"/>
-      </w:pPr>
-      <w:r>
-        <w:rPr>
-          <w:rFonts w:ascii="Times New Roman" w:hAnsi="Times New Roman" w:eastAsia="宋体" w:cs="Times New Roman"/>
-          <w:sz w:val="21"/>
-        </w:rPr>
         <w:t>Ching, T., Himmelstein, D. S., Beaulieu-Jones, B. K., Kalinin, A. A., Do, B. T., Way, G. P., et al. (2018). Opportunities and obstacles for deep learning in biology and medicine. J R Soc Interface. 15(141):20170387. doi:10.1098/rsif.2017.0387. PMID:29618526.</w:t>
       </w:r>
     </w:p>
@@ -4647,6 +4633,12 @@
       </w:r>
     </w:p>
     <w:p>
+      <w:pPr/>
+      <w:r>
+        <w:t>Hanahan, D., and Weinberg, R. A. (2011). Hallmarks of cancer: the next generation. Cell. 144(5):646-674. doi:10.1016/j.cell.2011.02.013. PMID:21376230.</w:t>
+      </w:r>
+    </w:p>
+    <w:p>
       <w:pPr>
         <w:spacing w:after="80" w:line="240" w:lineRule="auto"/>
         <w:ind w:left="0" w:firstLine="0"/>
@@ -4786,7 +4778,7 @@
           <w:rFonts w:ascii="Times New Roman" w:hAnsi="Times New Roman" w:eastAsia="宋体" w:cs="Times New Roman"/>
           <w:sz w:val="21"/>
         </w:rPr>
-        <w:t>Li, Q., Liu, L., Zhang, Q., Zhang, X., Li, N., Zhao, Y., et al. (2025). MoACNN-XGNet: interpretable multi-omics convolutional network for breast cancer subtyping and prognostic genes identification. IEEE J Biomed Health Inform. Early access. doi:10.1109/JBHI.2025.3595381.</w:t>
+        <w:t>Li, Q., Liu, L., Zhang, Q., Zhang, X., Li, N., Zhao, Y., et al. (2026). MoACNN-XGNet: Interpretable Multi-Omics Convolutional Network for Breast Cancer Subtyping and Prognostic Genes Identification. IEEE J Biomed Health Inform. 30(4):3267-3280. doi:10.1109/JBHI.2025.3595381.</w:t>
       </w:r>
     </w:p>
     <w:p>
@@ -4826,6 +4818,12 @@
           <w:sz w:val="21"/>
         </w:rPr>
         <w:t>Lundberg, S. M., and Lee, S. I. (2017). A unified approach to interpreting model predictions. In: Advances in Neural Information Processing Systems. 30:4765-4774. arXiv:1705.07874.</w:t>
+      </w:r>
+    </w:p>
+    <w:p>
+      <w:pPr/>
+      <w:r>
+        <w:t>Luo, J., Solimini, N. L., and Elledge, S. J. (2009). Principles of cancer therapy: oncogene and non-oncogene addiction. Cell. 136(5):823-837. doi:10.1016/j.cell.2009.02.024. PMID:19269363.</w:t>
       </w:r>
     </w:p>
     <w:p>
@@ -5004,19 +5002,6 @@
           <w:rFonts w:ascii="Times New Roman" w:hAnsi="Times New Roman" w:eastAsia="宋体" w:cs="Times New Roman"/>
           <w:sz w:val="21"/>
         </w:rPr>
-        <w:t>Sui, W., Wang, J., Miao, D., Jiang, Y., Liu, G., Yang, S., et al. (2026). The Evolution of Modeling Approaches: From Statistical Models to Deep Learning for Locust and Grasshopper Forecasting. Insects. 17(2):182. doi:10.3390/insects17020182.</w:t>
-      </w:r>
-    </w:p>
-    <w:p>
-      <w:pPr>
-        <w:spacing w:after="80" w:line="240" w:lineRule="auto"/>
-        <w:ind w:left="0" w:firstLine="0"/>
-      </w:pPr>
-      <w:r>
-        <w:rPr>
-          <w:rFonts w:ascii="Times New Roman" w:hAnsi="Times New Roman" w:eastAsia="宋体" w:cs="Times New Roman"/>
-          <w:sz w:val="21"/>
-        </w:rPr>
         <w:t>Sørlie, T., Perou, C. M., Tibshirani, R., Aas, T., Geisler, S., Johnsen, H., et al. (2001). Gene expression patterns of breast carcinomas distinguish tumor subclasses with clinical implications. Proc Natl Acad Sci U S A. 98(19):10869-10874. doi:10.1073/pnas.191367098. PMID:11553815.</w:t>
       </w:r>
     </w:p>
@@ -5266,7 +5251,7 @@
           <w:b w:val="0"/>
           <w:sz w:val="22"/>
         </w:rPr>
-        <w:t>The raw public data are available from the NCI Genomic Data Commons (project TCGA-BRCA) and UCSC Xena. Processed data, feature-selection and modeling code, JSD images, result tables, supplementary material, and reproducibility notes are available in the GitHub repository Supervised_distribution_divergence_omics_imaging_breast_cancer (https://github.com/381521602/Supervised_distribution_divergence_omics_imaging_breast_cancer).</w:t>
+        <w:t>The raw public data are available from the NCI Genomic Data Commons (project TCGA-BRCA) and UCSC Xena. Processed data, feature-selection and modeling code, JSD images, result tables, supplementary material, and reproducibility notes are available in the GitHub repository Supervised_distribution_divergence_omics_imaging_breast_cancer (https://github.com/381521602/Supervised_distribution_divergence_omics_imaging_breast_cancer), archived at commit e74de48.</w:t>
       </w:r>
     </w:p>
     <w:p>

</xml_diff>